<commit_message>
Apply GCTU student details to deliverables
</commit_message>
<xml_diff>
--- a/docs/final-report/final-report-gctu-structure.docx
+++ b/docs/final-report/final-report-gctu-structure.docx
@@ -55,7 +55,21 @@
           <w:b/>
           <w:sz w:val="40"/>
         </w:rPr>
-        <w:t>DESIGN AND EVALUATION OF A SIMULATION-BASED ADAPTIVE SMART TRAFFIC-LIGHT CONTROLLER</w:t>
+        <w:t>DESIGN AND EVALUATION OF A</w:t>
+      </w:r>
+    </w:p>
+    <w:p>
+      <w:pPr>
+        <w:spacing w:after="240"/>
+        <w:jc w:val="center"/>
+      </w:pPr>
+      <w:r>
+        <w:rPr>
+          <w:rFonts w:ascii="Arial" w:hAnsi="Arial"/>
+          <w:b/>
+          <w:sz w:val="30"/>
+        </w:rPr>
+        <w:t>SIMULATION-BASED ADAPTIVE SMART TRAFFIC-LIGHT CONTROLLER</w:t>
       </w:r>
     </w:p>
     <w:p>
@@ -93,11 +107,25 @@
       </w:pPr>
       <w:r>
         <w:rPr>
-          <w:rFonts w:ascii="Times New Roman" w:hAnsi="Times New Roman"/>
+          <w:rFonts w:ascii="Arial" w:hAnsi="Arial"/>
           <w:b/>
-          <w:sz w:val="26"/>
+          <w:sz w:val="30"/>
         </w:rPr>
-        <w:t>[STUDENT NAME] - ID [STUDENT ID]</w:t>
+        <w:t>HENYO THEOPHILUS - ID 4121230031</w:t>
+      </w:r>
+    </w:p>
+    <w:p>
+      <w:pPr>
+        <w:spacing w:after="240"/>
+        <w:jc w:val="center"/>
+      </w:pPr>
+      <w:r>
+        <w:rPr>
+          <w:rFonts w:ascii="Arial" w:hAnsi="Arial"/>
+          <w:b/>
+          <w:sz w:val="30"/>
+        </w:rPr>
+        <w:t>DJAGNI JERRY KODJO - ID 4121230036</w:t>
       </w:r>
     </w:p>
     <w:p>
@@ -121,11 +149,11 @@
       </w:pPr>
       <w:r>
         <w:rPr>
-          <w:rFonts w:ascii="Times New Roman" w:hAnsi="Times New Roman"/>
+          <w:rFonts w:ascii="Arial" w:hAnsi="Arial"/>
           <w:b/>
-          <w:sz w:val="26"/>
+          <w:sz w:val="30"/>
         </w:rPr>
-        <w:t>[SUPERVISOR NAME]</w:t>
+        <w:t>DR. PHILLIP KISEMBE</w:t>
       </w:r>
     </w:p>
     <w:p>

</xml_diff>